<commit_message>
docs(week01): update GitHub repo and commit links
</commit_message>
<xml_diff>
--- a/Week01/Week01_BaoCaoNhom.docx
+++ b/Week01/Week01_BaoCaoNhom.docx
@@ -396,14 +396,7 @@
               <w:jc w:val="left"/>
             </w:pPr>
             <w:r>
-              <w:rPr>
-                <w:rFonts w:ascii="Times New Roman" w:cs="Times New Roman" w:eastAsia="Times New Roman" w:hAnsi="Times New Roman"/>
-                <w:b w:val="false"/>
-                <w:bCs w:val="false"/>
-                <w:sz w:val="24"/>
-                <w:szCs w:val="24"/>
-              </w:rPr>
-              <w:t xml:space="preserve">[https://github.com/...]</w:t>
+              <w:t>https://github.com/fudn-traltb-su26/rbl-fer202-theotuan-team-fjms</w:t>
             </w:r>
           </w:p>
         </w:tc>
@@ -1450,14 +1443,7 @@
               <w:jc w:val="left"/>
             </w:pPr>
             <w:r>
-              <w:rPr>
-                <w:rFonts w:ascii="Times New Roman" w:cs="Times New Roman" w:eastAsia="Times New Roman" w:hAnsi="Times New Roman"/>
-                <w:b w:val="false"/>
-                <w:bCs w:val="false"/>
-                <w:sz w:val="24"/>
-                <w:szCs w:val="24"/>
-              </w:rPr>
-              <w:t xml:space="preserve">[https://github.com/.../commits/...]</w:t>
+              <w:t>https://github.com/fudn-traltb-su26/rbl-fer202-theotuan-team-fjms/commit/a77a4b9</w:t>
             </w:r>
           </w:p>
         </w:tc>
@@ -3328,7 +3314,7 @@
               <w:jc w:val="left"/>
             </w:pPr>
             <w:r>
-              <w:t>docs/mockup/prompts.md</w:t>
+              <w:t>https://github.com/fudn-traltb-su26/rbl-fer202-theotuan-team-fjms/tree/main/Week01</w:t>
             </w:r>
           </w:p>
         </w:tc>
@@ -3976,7 +3962,7 @@
           </w:tcPr>
           <w:p>
             <w:r>
-              <w:t>Link repo GitHub</w:t>
+              <w:t>https://github.com/fudn-traltb-su26/rbl-fer202-theotuan-team-fjms</w:t>
             </w:r>
           </w:p>
         </w:tc>

</xml_diff>

<commit_message>
docs: complete section 3.2 in Week 01 report
</commit_message>
<xml_diff>
--- a/Week01/Week01_BaoCaoNhom.docx
+++ b/Week01/Week01_BaoCaoNhom.docx
@@ -2390,12 +2390,7 @@
         <w:spacing w:before="60" w:after="60"/>
       </w:pPr>
       <w:r>
-        <w:rPr>
-          <w:i/>
-          <w:iCs/>
-          <w:color w:val="AAB7C4"/>
-        </w:rPr>
-        <w:t>[Thành viên phụ trách điền vào đây: mô tả approach đã chọn, lý do chọn, khó khăn gặp phải và cách giải quyết...]</w:t>
+        <w:t>Trong tuần đầu tiên triển khai dự án Freelancer Job Matching System (FJMS), nhóm chúng tôi đã tiếp cận công việc theo quy trình chuẩn của phần mềm. Đầu tiên, nhóm phân tích yêu cầu nghiệp vụ để xác định các chức năng cốt lõi cho 4 màn hình chính: Trang chủ, Danh sách dự án, Chi tiết dự án và Giỏ hàng lưu trữ. Tiếp theo, các thành viên phụ trách thiết kế sử dụng các công cụ AI hỗ trợ như Google Stitch và Figma Make để tạo ra các mockup trực quan dựa trên bảng Style Guide đã thống nhất về màu sắc chủ đạo (Emerald Green) và font chữ (Inter). Trong quá trình này, nhóm gặp khó khăn khi AI sinh các giao diện chưa hoàn toàn tối ưu hoặc không đồng bộ về khoảng cách. Nhóm đã giải quyết bằng cách tinh chỉnh thủ công các component và thống nhất bảng handoff chi tiết. Song song đó, trưởng nhóm đã khởi tạo thành công dự án React 19 + Vite, cấu hình các thư viện cần thiết (react-bootstrap, axios, react-router-dom) và tổ chức cấu trúc thư mục mã nguồn theo chuẩn module hóa để phát triển lâu dài. Cuối cùng, dữ liệu db.json được thiết lập với đầy đủ các dự án mẫu để sẵn sàng tích hợp mock API ở các tuần tiếp theo.</w:t>
       </w:r>
     </w:p>
     <w:p>
@@ -2407,14 +2402,7 @@
       <w:pPr>
         <w:spacing w:before="60" w:after="60"/>
       </w:pPr>
-      <w:r>
-        <w:rPr>
-          <w:i/>
-          <w:iCs/>
-          <w:color w:val="AAB7C4"/>
-        </w:rPr>
-        <w:t>[...]</w:t>
-      </w:r>
+      <w:r/>
     </w:p>
     <w:p>
       <w:pPr>

</xml_diff>

<commit_message>
feat: week01 - init FJMS project, structure, db.json, README
</commit_message>
<xml_diff>
--- a/Week01/Week01_BaoCaoNhom.docx
+++ b/Week01/Week01_BaoCaoNhom.docx
@@ -123,12 +123,6 @@
         <w:gridCol w:w="6026"/>
       </w:tblGrid>
       <w:tr>
-        <w:tblPrEx>
-          <w:tblCellMar>
-            <w:top w:w="0" w:type="dxa"/>
-            <w:bottom w:w="0" w:type="dxa"/>
-          </w:tblCellMar>
-        </w:tblPrEx>
         <w:tc>
           <w:tcPr>
             <w:tcW w:w="3000" w:type="dxa"/>
@@ -194,12 +188,6 @@
         </w:tc>
       </w:tr>
       <w:tr>
-        <w:tblPrEx>
-          <w:tblCellMar>
-            <w:top w:w="0" w:type="dxa"/>
-            <w:bottom w:w="0" w:type="dxa"/>
-          </w:tblCellMar>
-        </w:tblPrEx>
         <w:tc>
           <w:tcPr>
             <w:tcW w:w="3000" w:type="dxa"/>
@@ -262,12 +250,6 @@
         </w:tc>
       </w:tr>
       <w:tr>
-        <w:tblPrEx>
-          <w:tblCellMar>
-            <w:top w:w="0" w:type="dxa"/>
-            <w:bottom w:w="0" w:type="dxa"/>
-          </w:tblCellMar>
-        </w:tblPrEx>
         <w:tc>
           <w:tcPr>
             <w:tcW w:w="3000" w:type="dxa"/>
@@ -330,12 +312,6 @@
         </w:tc>
       </w:tr>
       <w:tr>
-        <w:tblPrEx>
-          <w:tblCellMar>
-            <w:top w:w="0" w:type="dxa"/>
-            <w:bottom w:w="0" w:type="dxa"/>
-          </w:tblCellMar>
-        </w:tblPrEx>
         <w:tc>
           <w:tcPr>
             <w:tcW w:w="3000" w:type="dxa"/>
@@ -388,12 +364,6 @@
         </w:tc>
       </w:tr>
       <w:tr>
-        <w:tblPrEx>
-          <w:tblCellMar>
-            <w:top w:w="0" w:type="dxa"/>
-            <w:bottom w:w="0" w:type="dxa"/>
-          </w:tblCellMar>
-        </w:tblPrEx>
         <w:tc>
           <w:tcPr>
             <w:tcW w:w="3000" w:type="dxa"/>
@@ -450,12 +420,6 @@
         </w:tc>
       </w:tr>
       <w:tr>
-        <w:tblPrEx>
-          <w:tblCellMar>
-            <w:top w:w="0" w:type="dxa"/>
-            <w:bottom w:w="0" w:type="dxa"/>
-          </w:tblCellMar>
-        </w:tblPrEx>
         <w:tc>
           <w:tcPr>
             <w:tcW w:w="3000" w:type="dxa"/>
@@ -574,12 +538,6 @@
         <w:gridCol w:w="1467"/>
       </w:tblGrid>
       <w:tr>
-        <w:tblPrEx>
-          <w:tblCellMar>
-            <w:top w:w="0" w:type="dxa"/>
-            <w:bottom w:w="0" w:type="dxa"/>
-          </w:tblCellMar>
-        </w:tblPrEx>
         <w:tc>
           <w:tcPr>
             <w:tcW w:w="500" w:type="dxa"/>
@@ -747,12 +705,6 @@
         </w:tc>
       </w:tr>
       <w:tr>
-        <w:tblPrEx>
-          <w:tblCellMar>
-            <w:top w:w="0" w:type="dxa"/>
-            <w:bottom w:w="0" w:type="dxa"/>
-          </w:tblCellMar>
-        </w:tblPrEx>
         <w:tc>
           <w:tcPr>
             <w:tcW w:w="500" w:type="dxa"/>
@@ -904,12 +856,6 @@
         </w:tc>
       </w:tr>
       <w:tr>
-        <w:tblPrEx>
-          <w:tblCellMar>
-            <w:top w:w="0" w:type="dxa"/>
-            <w:bottom w:w="0" w:type="dxa"/>
-          </w:tblCellMar>
-        </w:tblPrEx>
         <w:tc>
           <w:tcPr>
             <w:tcW w:w="500" w:type="dxa"/>
@@ -1059,12 +1005,6 @@
         </w:tc>
       </w:tr>
       <w:tr>
-        <w:tblPrEx>
-          <w:tblCellMar>
-            <w:top w:w="0" w:type="dxa"/>
-            <w:bottom w:w="0" w:type="dxa"/>
-          </w:tblCellMar>
-        </w:tblPrEx>
         <w:tc>
           <w:tcPr>
             <w:tcW w:w="500" w:type="dxa"/>
@@ -1250,12 +1190,6 @@
         <w:gridCol w:w="4513"/>
       </w:tblGrid>
       <w:tr>
-        <w:tblPrEx>
-          <w:tblCellMar>
-            <w:top w:w="0" w:type="dxa"/>
-            <w:bottom w:w="0" w:type="dxa"/>
-          </w:tblCellMar>
-        </w:tblPrEx>
         <w:tc>
           <w:tcPr>
             <w:tcW w:w="4513" w:type="dxa"/>
@@ -1312,12 +1246,6 @@
         </w:tc>
       </w:tr>
       <w:tr>
-        <w:tblPrEx>
-          <w:tblCellMar>
-            <w:top w:w="0" w:type="dxa"/>
-            <w:bottom w:w="0" w:type="dxa"/>
-          </w:tblCellMar>
-        </w:tblPrEx>
         <w:tc>
           <w:tcPr>
             <w:tcW w:w="4513" w:type="dxa"/>
@@ -1451,12 +1379,6 @@
         <w:gridCol w:w="1400"/>
       </w:tblGrid>
       <w:tr>
-        <w:tblPrEx>
-          <w:tblCellMar>
-            <w:top w:w="0" w:type="dxa"/>
-            <w:bottom w:w="0" w:type="dxa"/>
-          </w:tblCellMar>
-        </w:tblPrEx>
         <w:tc>
           <w:tcPr>
             <w:tcW w:w="400" w:type="dxa"/>
@@ -1591,12 +1513,6 @@
         </w:tc>
       </w:tr>
       <w:tr>
-        <w:tblPrEx>
-          <w:tblCellMar>
-            <w:top w:w="0" w:type="dxa"/>
-            <w:bottom w:w="0" w:type="dxa"/>
-          </w:tblCellMar>
-        </w:tblPrEx>
         <w:tc>
           <w:tcPr>
             <w:tcW w:w="400" w:type="dxa"/>
@@ -1708,12 +1624,6 @@
         </w:tc>
       </w:tr>
       <w:tr>
-        <w:tblPrEx>
-          <w:tblCellMar>
-            <w:top w:w="0" w:type="dxa"/>
-            <w:bottom w:w="0" w:type="dxa"/>
-          </w:tblCellMar>
-        </w:tblPrEx>
         <w:tc>
           <w:tcPr>
             <w:tcW w:w="400" w:type="dxa"/>
@@ -1825,12 +1735,6 @@
         </w:tc>
       </w:tr>
       <w:tr>
-        <w:tblPrEx>
-          <w:tblCellMar>
-            <w:top w:w="0" w:type="dxa"/>
-            <w:bottom w:w="0" w:type="dxa"/>
-          </w:tblCellMar>
-        </w:tblPrEx>
         <w:tc>
           <w:tcPr>
             <w:tcW w:w="400" w:type="dxa"/>
@@ -1940,12 +1844,6 @@
         </w:tc>
       </w:tr>
       <w:tr>
-        <w:tblPrEx>
-          <w:tblCellMar>
-            <w:top w:w="0" w:type="dxa"/>
-            <w:bottom w:w="0" w:type="dxa"/>
-          </w:tblCellMar>
-        </w:tblPrEx>
         <w:tc>
           <w:tcPr>
             <w:tcW w:w="400" w:type="dxa"/>
@@ -2055,12 +1953,6 @@
         </w:tc>
       </w:tr>
       <w:tr>
-        <w:tblPrEx>
-          <w:tblCellMar>
-            <w:top w:w="0" w:type="dxa"/>
-            <w:bottom w:w="0" w:type="dxa"/>
-          </w:tblCellMar>
-        </w:tblPrEx>
         <w:tc>
           <w:tcPr>
             <w:tcW w:w="400" w:type="dxa"/>
@@ -2166,18 +2058,10 @@
               </w:rPr>
               <w:t>Nguyễn Đăng Khang Huy</w:t>
             </w:r>
-            <w:bookmarkStart w:id="0" w:name="_GoBack"/>
-            <w:bookmarkEnd w:id="0"/>
           </w:p>
         </w:tc>
       </w:tr>
       <w:tr>
-        <w:tblPrEx>
-          <w:tblCellMar>
-            <w:top w:w="0" w:type="dxa"/>
-            <w:bottom w:w="0" w:type="dxa"/>
-          </w:tblCellMar>
-        </w:tblPrEx>
         <w:tc>
           <w:tcPr>
             <w:tcW w:w="400" w:type="dxa"/>
@@ -2289,12 +2173,6 @@
         </w:tc>
       </w:tr>
       <w:tr>
-        <w:tblPrEx>
-          <w:tblCellMar>
-            <w:top w:w="0" w:type="dxa"/>
-            <w:bottom w:w="0" w:type="dxa"/>
-          </w:tblCellMar>
-        </w:tblPrEx>
         <w:trPr>
           <w:trHeight w:val="64"/>
         </w:trPr>
@@ -2402,7 +2280,6 @@
       <w:pPr>
         <w:spacing w:before="60" w:after="60"/>
       </w:pPr>
-      <w:r/>
     </w:p>
     <w:p>
       <w:pPr>
@@ -2511,6 +2388,138 @@
           <w:color w:val="7F8C8D"/>
         </w:rPr>
         <w:t>Chèn ảnh chụp màn hình các tính năng đã hoàn thành (tối thiểu 2 ảnh). Ghi chú bên dưới mỗi ảnh.</w:t>
+      </w:r>
+    </w:p>
+    <w:p>
+      <w:pPr>
+        <w:spacing w:before="60"/>
+      </w:pPr>
+    </w:p>
+    <w:p>
+      <w:pPr>
+        <w:keepNext/>
+        <w:spacing w:before="60"/>
+      </w:pPr>
+      <w:r>
+        <w:lastRenderedPageBreak/>
+        <w:drawing>
+          <wp:inline distT="0" distB="0" distL="0" distR="0" wp14:anchorId="4D88F55B" wp14:editId="5F4C49A0">
+            <wp:extent cx="5940425" cy="3643630"/>
+            <wp:effectExtent l="0" t="0" r="3175" b="0"/>
+            <wp:docPr id="1" name="Hình ảnh 1"/>
+            <wp:cNvGraphicFramePr>
+              <a:graphicFrameLocks xmlns:a="http://schemas.openxmlformats.org/drawingml/2006/main" noChangeAspect="1"/>
+            </wp:cNvGraphicFramePr>
+            <a:graphic xmlns:a="http://schemas.openxmlformats.org/drawingml/2006/main">
+              <a:graphicData uri="http://schemas.openxmlformats.org/drawingml/2006/picture">
+                <pic:pic xmlns:pic="http://schemas.openxmlformats.org/drawingml/2006/picture">
+                  <pic:nvPicPr>
+                    <pic:cNvPr id="1" name=""/>
+                    <pic:cNvPicPr/>
+                  </pic:nvPicPr>
+                  <pic:blipFill>
+                    <a:blip r:embed="rId7"/>
+                    <a:stretch>
+                      <a:fillRect/>
+                    </a:stretch>
+                  </pic:blipFill>
+                  <pic:spPr>
+                    <a:xfrm>
+                      <a:off x="0" y="0"/>
+                      <a:ext cx="5940425" cy="3643630"/>
+                    </a:xfrm>
+                    <a:prstGeom prst="rect">
+                      <a:avLst/>
+                    </a:prstGeom>
+                  </pic:spPr>
+                </pic:pic>
+              </a:graphicData>
+            </a:graphic>
+          </wp:inline>
+        </w:drawing>
+      </w:r>
+    </w:p>
+    <w:p>
+      <w:pPr>
+        <w:pStyle w:val="Chuthich"/>
+      </w:pPr>
+      <w:r>
+        <w:t>Home_Page.png</w:t>
+      </w:r>
+    </w:p>
+    <w:p>
+      <w:pPr>
+        <w:keepNext/>
+        <w:spacing w:before="60"/>
+      </w:pPr>
+      <w:r>
+        <w:lastRenderedPageBreak/>
+        <w:drawing>
+          <wp:inline distT="0" distB="0" distL="0" distR="0" wp14:anchorId="3365B207" wp14:editId="1A9A4873">
+            <wp:extent cx="5839640" cy="6039693"/>
+            <wp:effectExtent l="0" t="0" r="8890" b="0"/>
+            <wp:docPr id="5" name="Hình ảnh 5"/>
+            <wp:cNvGraphicFramePr>
+              <a:graphicFrameLocks xmlns:a="http://schemas.openxmlformats.org/drawingml/2006/main" noChangeAspect="1"/>
+            </wp:cNvGraphicFramePr>
+            <a:graphic xmlns:a="http://schemas.openxmlformats.org/drawingml/2006/main">
+              <a:graphicData uri="http://schemas.openxmlformats.org/drawingml/2006/picture">
+                <pic:pic xmlns:pic="http://schemas.openxmlformats.org/drawingml/2006/picture">
+                  <pic:nvPicPr>
+                    <pic:cNvPr id="1" name=""/>
+                    <pic:cNvPicPr/>
+                  </pic:nvPicPr>
+                  <pic:blipFill>
+                    <a:blip r:embed="rId8"/>
+                    <a:stretch>
+                      <a:fillRect/>
+                    </a:stretch>
+                  </pic:blipFill>
+                  <pic:spPr>
+                    <a:xfrm>
+                      <a:off x="0" y="0"/>
+                      <a:ext cx="5839640" cy="6039693"/>
+                    </a:xfrm>
+                    <a:prstGeom prst="rect">
+                      <a:avLst/>
+                    </a:prstGeom>
+                  </pic:spPr>
+                </pic:pic>
+              </a:graphicData>
+            </a:graphic>
+          </wp:inline>
+        </w:drawing>
+      </w:r>
+    </w:p>
+    <w:p>
+      <w:pPr>
+        <w:pStyle w:val="Chuthich"/>
+      </w:pPr>
+      <w:r>
+        <w:t>project_details.png</w:t>
+      </w:r>
+      <w:bookmarkStart w:id="0" w:name="_GoBack"/>
+      <w:bookmarkEnd w:id="0"/>
+    </w:p>
+    <w:p>
+      <w:pPr>
+        <w:pStyle w:val="u1"/>
+      </w:pPr>
+      <w:r>
+        <w:t>V. CHECKLIST ĐẦU RA — TUẦN 01</w:t>
+      </w:r>
+    </w:p>
+    <w:p>
+      <w:pPr>
+        <w:spacing w:before="60" w:after="60"/>
+      </w:pPr>
+      <w:r>
+        <w:rPr>
+          <w:i/>
+          <w:iCs/>
+          <w:color w:val="7F8C8D"/>
+        </w:rPr>
+        <w:t>Đánh dấu ☑ vào cột "HT?" cho mỗi đầu ra đã hoàn thành. Ghi rõ file/folder/link lưu kết quả.</w:t>
       </w:r>
     </w:p>
     <w:p>
@@ -2536,131 +2545,13 @@
         <w:tblLook w:val="04A0" w:firstRow="1" w:lastRow="0" w:firstColumn="1" w:lastColumn="0" w:noHBand="0" w:noVBand="1"/>
       </w:tblPr>
       <w:tblGrid>
-        <w:gridCol w:w="4500"/>
-        <w:gridCol w:w="4526"/>
+        <w:gridCol w:w="381"/>
+        <w:gridCol w:w="2432"/>
+        <w:gridCol w:w="854"/>
+        <w:gridCol w:w="3887"/>
+        <w:gridCol w:w="1472"/>
       </w:tblGrid>
       <w:tr>
-        <w:tblPrEx>
-          <w:tblCellMar>
-            <w:top w:w="0" w:type="dxa"/>
-            <w:bottom w:w="0" w:type="dxa"/>
-          </w:tblCellMar>
-        </w:tblPrEx>
-        <w:tc>
-          <w:tcPr>
-            <w:tcW w:w="4500" w:type="dxa"/>
-            <w:tcBorders>
-              <w:top w:val="single" w:sz="1" w:space="0" w:color="AAB7C4"/>
-              <w:left w:val="single" w:sz="1" w:space="0" w:color="AAB7C4"/>
-              <w:bottom w:val="single" w:sz="1" w:space="0" w:color="AAB7C4"/>
-              <w:right w:val="single" w:sz="1" w:space="0" w:color="AAB7C4"/>
-            </w:tcBorders>
-            <w:shd w:val="clear" w:color="auto" w:fill="F4F6F8"/>
-            <w:tcMar>
-              <w:top w:w="80" w:type="dxa"/>
-              <w:left w:w="120" w:type="dxa"/>
-              <w:bottom w:w="80" w:type="dxa"/>
-              <w:right w:w="120" w:type="dxa"/>
-            </w:tcMar>
-          </w:tcPr>
-          <w:p>
-            <w:r>
-              <w:t>Screenshot: Mockup Trang chủ &amp; Danh sách công việc (Home_Page.png &amp; Project_List.png)</w:t>
-            </w:r>
-          </w:p>
-        </w:tc>
-        <w:tc>
-          <w:tcPr>
-            <w:tcW w:w="4526" w:type="dxa"/>
-            <w:tcBorders>
-              <w:top w:val="single" w:sz="1" w:space="0" w:color="AAB7C4"/>
-              <w:left w:val="single" w:sz="1" w:space="0" w:color="AAB7C4"/>
-              <w:bottom w:val="single" w:sz="1" w:space="0" w:color="AAB7C4"/>
-              <w:right w:val="single" w:sz="1" w:space="0" w:color="AAB7C4"/>
-            </w:tcBorders>
-            <w:shd w:val="clear" w:color="auto" w:fill="F4F6F8"/>
-            <w:tcMar>
-              <w:top w:w="80" w:type="dxa"/>
-              <w:left w:w="120" w:type="dxa"/>
-              <w:bottom w:w="80" w:type="dxa"/>
-              <w:right w:w="120" w:type="dxa"/>
-            </w:tcMar>
-          </w:tcPr>
-          <w:p>
-            <w:r>
-              <w:t>Screenshot: Mockup Chi tiết dự án &amp; Danh sách lưu (project_details.png &amp; saved_projects.png)</w:t>
-            </w:r>
-          </w:p>
-        </w:tc>
-      </w:tr>
-    </w:tbl>
-    <w:p>
-      <w:pPr>
-        <w:spacing w:before="60"/>
-      </w:pPr>
-    </w:p>
-    <w:p>
-      <w:pPr>
-        <w:spacing w:before="60"/>
-      </w:pPr>
-    </w:p>
-    <w:p>
-      <w:pPr>
-        <w:pStyle w:val="u1"/>
-      </w:pPr>
-      <w:r>
-        <w:t>V. CHECKLIST ĐẦU RA — TUẦN 01</w:t>
-      </w:r>
-    </w:p>
-    <w:p>
-      <w:pPr>
-        <w:spacing w:before="60" w:after="60"/>
-      </w:pPr>
-      <w:r>
-        <w:rPr>
-          <w:i/>
-          <w:iCs/>
-          <w:color w:val="7F8C8D"/>
-        </w:rPr>
-        <w:t>Đánh dấu ☑ vào cột "HT?" cho mỗi đầu ra đã hoàn thành. Ghi rõ file/folder/link lưu kết quả.</w:t>
-      </w:r>
-    </w:p>
-    <w:p>
-      <w:pPr>
-        <w:spacing w:before="60"/>
-      </w:pPr>
-    </w:p>
-    <w:tbl>
-      <w:tblPr>
-        <w:tblW w:w="9026" w:type="dxa"/>
-        <w:tblBorders>
-          <w:top w:val="single" w:sz="4" w:space="0" w:color="auto"/>
-          <w:left w:val="single" w:sz="4" w:space="0" w:color="auto"/>
-          <w:bottom w:val="single" w:sz="4" w:space="0" w:color="auto"/>
-          <w:right w:val="single" w:sz="4" w:space="0" w:color="auto"/>
-          <w:insideH w:val="single" w:sz="4" w:space="0" w:color="auto"/>
-          <w:insideV w:val="single" w:sz="4" w:space="0" w:color="auto"/>
-        </w:tblBorders>
-        <w:tblCellMar>
-          <w:left w:w="10" w:type="dxa"/>
-          <w:right w:w="10" w:type="dxa"/>
-        </w:tblCellMar>
-        <w:tblLook w:val="04A0" w:firstRow="1" w:lastRow="0" w:firstColumn="1" w:lastColumn="0" w:noHBand="0" w:noVBand="1"/>
-      </w:tblPr>
-      <w:tblGrid>
-        <w:gridCol w:w="395"/>
-        <w:gridCol w:w="3269"/>
-        <w:gridCol w:w="1030"/>
-        <w:gridCol w:w="2905"/>
-        <w:gridCol w:w="1427"/>
-      </w:tblGrid>
-      <w:tr>
-        <w:tblPrEx>
-          <w:tblCellMar>
-            <w:top w:w="0" w:type="dxa"/>
-            <w:bottom w:w="0" w:type="dxa"/>
-          </w:tblCellMar>
-        </w:tblPrEx>
         <w:tc>
           <w:tcPr>
             <w:tcW w:w="400" w:type="dxa"/>
@@ -2828,12 +2719,6 @@
         </w:tc>
       </w:tr>
       <w:tr>
-        <w:tblPrEx>
-          <w:tblCellMar>
-            <w:top w:w="0" w:type="dxa"/>
-            <w:bottom w:w="0" w:type="dxa"/>
-          </w:tblCellMar>
-        </w:tblPrEx>
         <w:tc>
           <w:tcPr>
             <w:tcW w:w="400" w:type="dxa"/>
@@ -2954,12 +2839,6 @@
         </w:tc>
       </w:tr>
       <w:tr>
-        <w:tblPrEx>
-          <w:tblCellMar>
-            <w:top w:w="0" w:type="dxa"/>
-            <w:bottom w:w="0" w:type="dxa"/>
-          </w:tblCellMar>
-        </w:tblPrEx>
         <w:tc>
           <w:tcPr>
             <w:tcW w:w="400" w:type="dxa"/>
@@ -2982,111 +2861,108 @@
               <w:jc w:val="center"/>
             </w:pPr>
             <w:r>
+              <w:t>2</w:t>
+            </w:r>
+          </w:p>
+        </w:tc>
+        <w:tc>
+          <w:tcPr>
+            <w:tcW w:w="3600" w:type="dxa"/>
+            <w:tcBorders>
+              <w:top w:val="single" w:sz="1" w:space="0" w:color="AAB7C4"/>
+              <w:left w:val="single" w:sz="1" w:space="0" w:color="AAB7C4"/>
+              <w:bottom w:val="single" w:sz="1" w:space="0" w:color="AAB7C4"/>
+              <w:right w:val="single" w:sz="1" w:space="0" w:color="AAB7C4"/>
+            </w:tcBorders>
+            <w:shd w:val="clear" w:color="auto" w:fill="FFFFFF"/>
+            <w:tcMar>
+              <w:top w:w="80" w:type="dxa"/>
+              <w:left w:w="120" w:type="dxa"/>
+              <w:bottom w:w="80" w:type="dxa"/>
+              <w:right w:w="120" w:type="dxa"/>
+            </w:tcMar>
+          </w:tcPr>
+          <w:p>
+            <w:r>
+              <w:t>Prompt log</w:t>
+            </w:r>
+          </w:p>
+        </w:tc>
+        <w:tc>
+          <w:tcPr>
+            <w:tcW w:w="1100" w:type="dxa"/>
+            <w:tcBorders>
+              <w:top w:val="single" w:sz="1" w:space="0" w:color="AAB7C4"/>
+              <w:left w:val="single" w:sz="1" w:space="0" w:color="AAB7C4"/>
+              <w:bottom w:val="single" w:sz="1" w:space="0" w:color="AAB7C4"/>
+              <w:right w:val="single" w:sz="1" w:space="0" w:color="AAB7C4"/>
+            </w:tcBorders>
+            <w:shd w:val="clear" w:color="auto" w:fill="FFFFFF"/>
+            <w:tcMar>
+              <w:top w:w="80" w:type="dxa"/>
+              <w:left w:w="120" w:type="dxa"/>
+              <w:bottom w:w="80" w:type="dxa"/>
+              <w:right w:w="120" w:type="dxa"/>
+            </w:tcMar>
+          </w:tcPr>
+          <w:p>
+            <w:r>
+              <w:t>[x]</w:t>
+            </w:r>
+          </w:p>
+        </w:tc>
+        <w:tc>
+          <w:tcPr>
+            <w:tcW w:w="2326" w:type="dxa"/>
+            <w:tcBorders>
+              <w:top w:val="single" w:sz="1" w:space="0" w:color="AAB7C4"/>
+              <w:left w:val="single" w:sz="1" w:space="0" w:color="AAB7C4"/>
+              <w:bottom w:val="single" w:sz="1" w:space="0" w:color="AAB7C4"/>
+              <w:right w:val="single" w:sz="1" w:space="0" w:color="AAB7C4"/>
+            </w:tcBorders>
+            <w:shd w:val="clear" w:color="auto" w:fill="F9FDF6"/>
+            <w:tcMar>
+              <w:top w:w="80" w:type="dxa"/>
+              <w:left w:w="120" w:type="dxa"/>
+              <w:bottom w:w="80" w:type="dxa"/>
+              <w:right w:w="120" w:type="dxa"/>
+            </w:tcMar>
+          </w:tcPr>
+          <w:p>
+            <w:r>
+              <w:t>Week01/docs/mockup/prompts.md</w:t>
+            </w:r>
+          </w:p>
+        </w:tc>
+        <w:tc>
+          <w:tcPr>
+            <w:tcW w:w="1600" w:type="dxa"/>
+            <w:tcBorders>
+              <w:top w:val="single" w:sz="1" w:space="0" w:color="AAB7C4"/>
+              <w:left w:val="single" w:sz="1" w:space="0" w:color="AAB7C4"/>
+              <w:bottom w:val="single" w:sz="1" w:space="0" w:color="AAB7C4"/>
+              <w:right w:val="single" w:sz="1" w:space="0" w:color="AAB7C4"/>
+            </w:tcBorders>
+            <w:shd w:val="clear" w:color="auto" w:fill="FFFFFF"/>
+            <w:tcMar>
+              <w:top w:w="80" w:type="dxa"/>
+              <w:left w:w="120" w:type="dxa"/>
+              <w:bottom w:w="80" w:type="dxa"/>
+              <w:right w:w="120" w:type="dxa"/>
+            </w:tcMar>
+          </w:tcPr>
+          <w:p>
+            <w:r>
+              <w:t xml:space="preserve">Toàn bộ prompts </w:t>
+            </w:r>
+            <w:r>
               <w:lastRenderedPageBreak/>
-              <w:t>2</w:t>
-            </w:r>
-          </w:p>
-        </w:tc>
-        <w:tc>
-          <w:tcPr>
-            <w:tcW w:w="3600" w:type="dxa"/>
-            <w:tcBorders>
-              <w:top w:val="single" w:sz="1" w:space="0" w:color="AAB7C4"/>
-              <w:left w:val="single" w:sz="1" w:space="0" w:color="AAB7C4"/>
-              <w:bottom w:val="single" w:sz="1" w:space="0" w:color="AAB7C4"/>
-              <w:right w:val="single" w:sz="1" w:space="0" w:color="AAB7C4"/>
-            </w:tcBorders>
-            <w:shd w:val="clear" w:color="auto" w:fill="FFFFFF"/>
-            <w:tcMar>
-              <w:top w:w="80" w:type="dxa"/>
-              <w:left w:w="120" w:type="dxa"/>
-              <w:bottom w:w="80" w:type="dxa"/>
-              <w:right w:w="120" w:type="dxa"/>
-            </w:tcMar>
-          </w:tcPr>
-          <w:p>
-            <w:r>
-              <w:t>Prompt log</w:t>
-            </w:r>
-          </w:p>
-        </w:tc>
-        <w:tc>
-          <w:tcPr>
-            <w:tcW w:w="1100" w:type="dxa"/>
-            <w:tcBorders>
-              <w:top w:val="single" w:sz="1" w:space="0" w:color="AAB7C4"/>
-              <w:left w:val="single" w:sz="1" w:space="0" w:color="AAB7C4"/>
-              <w:bottom w:val="single" w:sz="1" w:space="0" w:color="AAB7C4"/>
-              <w:right w:val="single" w:sz="1" w:space="0" w:color="AAB7C4"/>
-            </w:tcBorders>
-            <w:shd w:val="clear" w:color="auto" w:fill="FFFFFF"/>
-            <w:tcMar>
-              <w:top w:w="80" w:type="dxa"/>
-              <w:left w:w="120" w:type="dxa"/>
-              <w:bottom w:w="80" w:type="dxa"/>
-              <w:right w:w="120" w:type="dxa"/>
-            </w:tcMar>
-          </w:tcPr>
-          <w:p>
-            <w:r>
-              <w:t>[x]</w:t>
-            </w:r>
-          </w:p>
-        </w:tc>
-        <w:tc>
-          <w:tcPr>
-            <w:tcW w:w="2326" w:type="dxa"/>
-            <w:tcBorders>
-              <w:top w:val="single" w:sz="1" w:space="0" w:color="AAB7C4"/>
-              <w:left w:val="single" w:sz="1" w:space="0" w:color="AAB7C4"/>
-              <w:bottom w:val="single" w:sz="1" w:space="0" w:color="AAB7C4"/>
-              <w:right w:val="single" w:sz="1" w:space="0" w:color="AAB7C4"/>
-            </w:tcBorders>
-            <w:shd w:val="clear" w:color="auto" w:fill="F9FDF6"/>
-            <w:tcMar>
-              <w:top w:w="80" w:type="dxa"/>
-              <w:left w:w="120" w:type="dxa"/>
-              <w:bottom w:w="80" w:type="dxa"/>
-              <w:right w:w="120" w:type="dxa"/>
-            </w:tcMar>
-          </w:tcPr>
-          <w:p>
-            <w:r>
-              <w:t>Week01/docs/mockup/prompts.md</w:t>
-            </w:r>
-          </w:p>
-        </w:tc>
-        <w:tc>
-          <w:tcPr>
-            <w:tcW w:w="1600" w:type="dxa"/>
-            <w:tcBorders>
-              <w:top w:val="single" w:sz="1" w:space="0" w:color="AAB7C4"/>
-              <w:left w:val="single" w:sz="1" w:space="0" w:color="AAB7C4"/>
-              <w:bottom w:val="single" w:sz="1" w:space="0" w:color="AAB7C4"/>
-              <w:right w:val="single" w:sz="1" w:space="0" w:color="AAB7C4"/>
-            </w:tcBorders>
-            <w:shd w:val="clear" w:color="auto" w:fill="FFFFFF"/>
-            <w:tcMar>
-              <w:top w:w="80" w:type="dxa"/>
-              <w:left w:w="120" w:type="dxa"/>
-              <w:bottom w:w="80" w:type="dxa"/>
-              <w:right w:w="120" w:type="dxa"/>
-            </w:tcMar>
-          </w:tcPr>
-          <w:p>
-            <w:r>
-              <w:t>Toàn bộ prompts dùng thiết kế</w:t>
+              <w:t>dùng thiết kế</w:t>
             </w:r>
           </w:p>
         </w:tc>
       </w:tr>
       <w:tr>
-        <w:tblPrEx>
-          <w:tblCellMar>
-            <w:top w:w="0" w:type="dxa"/>
-            <w:bottom w:w="0" w:type="dxa"/>
-          </w:tblCellMar>
-        </w:tblPrEx>
         <w:tc>
           <w:tcPr>
             <w:tcW w:w="400" w:type="dxa"/>
@@ -3109,6 +2985,7 @@
               <w:jc w:val="center"/>
             </w:pPr>
             <w:r>
+              <w:lastRenderedPageBreak/>
               <w:t>3</w:t>
             </w:r>
           </w:p>
@@ -3207,12 +3084,6 @@
         </w:tc>
       </w:tr>
       <w:tr>
-        <w:tblPrEx>
-          <w:tblCellMar>
-            <w:top w:w="0" w:type="dxa"/>
-            <w:bottom w:w="0" w:type="dxa"/>
-          </w:tblCellMar>
-        </w:tblPrEx>
         <w:tc>
           <w:tcPr>
             <w:tcW w:w="400" w:type="dxa"/>
@@ -3333,12 +3204,6 @@
         </w:tc>
       </w:tr>
       <w:tr>
-        <w:tblPrEx>
-          <w:tblCellMar>
-            <w:top w:w="0" w:type="dxa"/>
-            <w:bottom w:w="0" w:type="dxa"/>
-          </w:tblCellMar>
-        </w:tblPrEx>
         <w:tc>
           <w:tcPr>
             <w:tcW w:w="400" w:type="dxa"/>
@@ -3459,12 +3324,6 @@
         </w:tc>
       </w:tr>
       <w:tr>
-        <w:tblPrEx>
-          <w:tblCellMar>
-            <w:top w:w="0" w:type="dxa"/>
-            <w:bottom w:w="0" w:type="dxa"/>
-          </w:tblCellMar>
-        </w:tblPrEx>
         <w:tc>
           <w:tcPr>
             <w:tcW w:w="400" w:type="dxa"/>
@@ -3582,12 +3441,6 @@
         </w:tc>
       </w:tr>
       <w:tr>
-        <w:tblPrEx>
-          <w:tblCellMar>
-            <w:top w:w="0" w:type="dxa"/>
-            <w:bottom w:w="0" w:type="dxa"/>
-          </w:tblCellMar>
-        </w:tblPrEx>
         <w:tc>
           <w:tcPr>
             <w:tcW w:w="400" w:type="dxa"/>
@@ -3640,12 +3493,6 @@
         </w:tc>
       </w:tr>
       <w:tr>
-        <w:tblPrEx>
-          <w:tblCellMar>
-            <w:top w:w="0" w:type="dxa"/>
-            <w:bottom w:w="0" w:type="dxa"/>
-          </w:tblCellMar>
-        </w:tblPrEx>
         <w:tc>
           <w:tcPr>
             <w:tcW w:w="400" w:type="dxa"/>
@@ -3698,12 +3545,6 @@
         </w:tc>
       </w:tr>
       <w:tr>
-        <w:tblPrEx>
-          <w:tblCellMar>
-            <w:top w:w="0" w:type="dxa"/>
-            <w:bottom w:w="0" w:type="dxa"/>
-          </w:tblCellMar>
-        </w:tblPrEx>
         <w:tc>
           <w:tcPr>
             <w:tcW w:w="400" w:type="dxa"/>
@@ -3817,12 +3658,6 @@
         <w:gridCol w:w="2000"/>
       </w:tblGrid>
       <w:tr>
-        <w:tblPrEx>
-          <w:tblCellMar>
-            <w:top w:w="0" w:type="dxa"/>
-            <w:bottom w:w="0" w:type="dxa"/>
-          </w:tblCellMar>
-        </w:tblPrEx>
         <w:tc>
           <w:tcPr>
             <w:tcW w:w="400" w:type="dxa"/>
@@ -3990,12 +3825,6 @@
         </w:tc>
       </w:tr>
       <w:tr>
-        <w:tblPrEx>
-          <w:tblCellMar>
-            <w:top w:w="0" w:type="dxa"/>
-            <w:bottom w:w="0" w:type="dxa"/>
-          </w:tblCellMar>
-        </w:tblPrEx>
         <w:tc>
           <w:tcPr>
             <w:tcW w:w="400" w:type="dxa"/>
@@ -4042,7 +3871,10 @@
           </w:tcPr>
           <w:p>
             <w:r>
-              <w:t>Lỗi cài đặt thư viện không đúng thư mục (cài nhầm ở thư mục Root thay vì fjms-frontend).</w:t>
+              <w:t xml:space="preserve">Lỗi cài đặt thư </w:t>
+            </w:r>
+            <w:r>
+              <w:t>viện không đúng thư mục (cài nhầm ở thư mục Root thay vì fjms-frontend).</w:t>
             </w:r>
           </w:p>
         </w:tc>
@@ -4117,12 +3949,6 @@
         </w:tc>
       </w:tr>
       <w:tr>
-        <w:tblPrEx>
-          <w:tblCellMar>
-            <w:top w:w="0" w:type="dxa"/>
-            <w:bottom w:w="0" w:type="dxa"/>
-          </w:tblCellMar>
-        </w:tblPrEx>
         <w:tc>
           <w:tcPr>
             <w:tcW w:w="400" w:type="dxa"/>
@@ -4167,9 +3993,7 @@
               <w:right w:w="120" w:type="dxa"/>
             </w:tcMar>
           </w:tcPr>
-          <w:p>
-            <w:r/>
-          </w:p>
+          <w:p/>
         </w:tc>
         <w:tc>
           <w:tcPr>
@@ -4188,9 +4012,7 @@
               <w:right w:w="120" w:type="dxa"/>
             </w:tcMar>
           </w:tcPr>
-          <w:p>
-            <w:r/>
-          </w:p>
+          <w:p/>
         </w:tc>
         <w:tc>
           <w:tcPr>
@@ -4209,9 +4031,7 @@
               <w:right w:w="120" w:type="dxa"/>
             </w:tcMar>
           </w:tcPr>
-          <w:p>
-            <w:r/>
-          </w:p>
+          <w:p/>
         </w:tc>
         <w:tc>
           <w:tcPr>
@@ -4230,18 +4050,10 @@
               <w:right w:w="120" w:type="dxa"/>
             </w:tcMar>
           </w:tcPr>
-          <w:p>
-            <w:r/>
-          </w:p>
+          <w:p/>
         </w:tc>
       </w:tr>
       <w:tr>
-        <w:tblPrEx>
-          <w:tblCellMar>
-            <w:top w:w="0" w:type="dxa"/>
-            <w:bottom w:w="0" w:type="dxa"/>
-          </w:tblCellMar>
-        </w:tblPrEx>
         <w:tc>
           <w:tcPr>
             <w:tcW w:w="400" w:type="dxa"/>
@@ -4286,9 +4098,7 @@
               <w:right w:w="120" w:type="dxa"/>
             </w:tcMar>
           </w:tcPr>
-          <w:p>
-            <w:r/>
-          </w:p>
+          <w:p/>
         </w:tc>
         <w:tc>
           <w:tcPr>
@@ -4307,9 +4117,7 @@
               <w:right w:w="120" w:type="dxa"/>
             </w:tcMar>
           </w:tcPr>
-          <w:p>
-            <w:r/>
-          </w:p>
+          <w:p/>
         </w:tc>
         <w:tc>
           <w:tcPr>
@@ -4328,9 +4136,7 @@
               <w:right w:w="120" w:type="dxa"/>
             </w:tcMar>
           </w:tcPr>
-          <w:p>
-            <w:r/>
-          </w:p>
+          <w:p/>
         </w:tc>
         <w:tc>
           <w:tcPr>
@@ -4349,9 +4155,7 @@
               <w:right w:w="120" w:type="dxa"/>
             </w:tcMar>
           </w:tcPr>
-          <w:p>
-            <w:r/>
-          </w:p>
+          <w:p/>
         </w:tc>
       </w:tr>
     </w:tbl>
@@ -4378,6 +4182,7 @@
         <w:spacing w:before="40" w:after="40"/>
       </w:pPr>
       <w:r>
+        <w:lastRenderedPageBreak/>
         <w:t>Học thuyết/Khái niệm: Nhóm chưa nắm thật sâu về cách tối ưu hóa các prompt để AI sinh mã nguồn CSS từ hình ảnh mockup.</w:t>
       </w:r>
     </w:p>
@@ -4408,8 +4213,8 @@
       </w:r>
     </w:p>
     <w:sectPr>
-      <w:headerReference w:type="default" r:id="rId7"/>
-      <w:footerReference w:type="default" r:id="rId8"/>
+      <w:headerReference w:type="default" r:id="rId9"/>
+      <w:footerReference w:type="default" r:id="rId10"/>
       <w:pgSz w:w="11906" w:h="16838"/>
       <w:pgMar w:top="1134" w:right="850" w:bottom="1134" w:left="1701" w:header="708" w:footer="708" w:gutter="0"/>
       <w:cols w:space="720"/>
@@ -5404,6 +5209,37 @@
       <w:szCs w:val="20"/>
     </w:rPr>
   </w:style>
+  <w:style w:type="character" w:styleId="cpChagiiquyt">
+    <w:name w:val="Unresolved Mention"/>
+    <w:basedOn w:val="Phngmcinhcuaoanvn"/>
+    <w:uiPriority w:val="99"/>
+    <w:semiHidden/>
+    <w:unhideWhenUsed/>
+    <w:rsid w:val="00303CDE"/>
+    <w:rPr>
+      <w:color w:val="605E5C"/>
+      <w:shd w:val="clear" w:color="auto" w:fill="E1DFDD"/>
+    </w:rPr>
+  </w:style>
+  <w:style w:type="paragraph" w:styleId="Chuthich">
+    <w:name w:val="caption"/>
+    <w:basedOn w:val="Binhthng"/>
+    <w:next w:val="Binhthng"/>
+    <w:uiPriority w:val="35"/>
+    <w:unhideWhenUsed/>
+    <w:qFormat/>
+    <w:rsid w:val="00303CDE"/>
+    <w:pPr>
+      <w:spacing w:after="200"/>
+    </w:pPr>
+    <w:rPr>
+      <w:i/>
+      <w:iCs/>
+      <w:color w:val="44546A" w:themeColor="text2"/>
+      <w:sz w:val="18"/>
+      <w:szCs w:val="18"/>
+    </w:rPr>
+  </w:style>
 </w:styles>
 </file>
 

</xml_diff>